<commit_message>
Add real author/affiliation to README and manuscript
Incorporate author details (Avin Piroutiniya, Universidad Complutense de Madrid)
from the remote README edit into the rebuilt README and regenerate the Word
manuscript with them.

Co-Authored-By: Claude Opus 4.8 <noreply@anthropic.com>
</commit_message>
<xml_diff>
--- a/JCIM_manuscript_rebuilt.docx
+++ b/JCIM_manuscript_rebuilt.docx
@@ -27,7 +27,7 @@
           <w:i w:val="0"/>
           <w:sz w:val="24"/>
         </w:rPr>
-        <w:t>Avin</w:t>
+        <w:t>Avin Piroutiniya</w:t>
       </w:r>
     </w:p>
     <w:p>
@@ -42,7 +42,7 @@
           <w:i/>
           <w:sz w:val="20"/>
         </w:rPr>
-        <w:t>Affiliation to be added</w:t>
+        <w:t>Universidad Complutense de Madrid, Madrid, Spain</w:t>
       </w:r>
     </w:p>
     <w:p>

</xml_diff>